<commit_message>
Big Integer with .net 6.0
</commit_message>
<xml_diff>
--- a/07_Methoden/07_Mitarbeitsfrage.docx
+++ b/07_Methoden/07_Mitarbeitsfrage.docx
@@ -162,21 +162,8 @@
             <w:pPr>
               <w:cnfStyle w:val="000000100000" w:firstRow="0" w:lastRow="0" w:firstColumn="0" w:lastColumn="0" w:oddVBand="0" w:evenVBand="0" w:oddHBand="1" w:evenHBand="0" w:firstRowFirstColumn="0" w:firstRowLastColumn="0" w:lastRowFirstColumn="0" w:lastRowLastColumn="0"/>
             </w:pPr>
-            <w:proofErr w:type="spellStart"/>
-            <w:r>
-              <w:t>void</w:t>
-            </w:r>
-            <w:proofErr w:type="spellEnd"/>
-            <w:r>
-              <w:t xml:space="preserve"> </w:t>
-            </w:r>
-            <w:proofErr w:type="gramStart"/>
-            <w:r>
-              <w:t>Eingabe(</w:t>
-            </w:r>
-            <w:proofErr w:type="gramEnd"/>
-            <w:r>
-              <w:t>)</w:t>
+            <w:r>
+              <w:t>void Eingabe()</w:t>
             </w:r>
             <w:r>
               <w:br/>
@@ -207,23 +194,7 @@
                 <w:b w:val="0"/>
                 <w:bCs w:val="0"/>
               </w:rPr>
-              <w:t xml:space="preserve">Definiere eine Methode mit einem Rückgabewert </w:t>
-            </w:r>
-            <w:proofErr w:type="spellStart"/>
-            <w:r>
-              <w:rPr>
-                <w:b w:val="0"/>
-                <w:bCs w:val="0"/>
-              </w:rPr>
-              <w:t>int</w:t>
-            </w:r>
-            <w:proofErr w:type="spellEnd"/>
-            <w:r>
-              <w:rPr>
-                <w:b w:val="0"/>
-                <w:bCs w:val="0"/>
-              </w:rPr>
-              <w:t>!</w:t>
+              <w:t>Definiere eine Methode mit einem Rückgabewert int!</w:t>
             </w:r>
           </w:p>
         </w:tc>
@@ -235,21 +206,8 @@
             <w:pPr>
               <w:cnfStyle w:val="000000000000" w:firstRow="0" w:lastRow="0" w:firstColumn="0" w:lastColumn="0" w:oddVBand="0" w:evenVBand="0" w:oddHBand="0" w:evenHBand="0" w:firstRowFirstColumn="0" w:firstRowLastColumn="0" w:lastRowFirstColumn="0" w:lastRowLastColumn="0"/>
             </w:pPr>
-            <w:proofErr w:type="spellStart"/>
-            <w:r>
-              <w:t>Int</w:t>
-            </w:r>
-            <w:proofErr w:type="spellEnd"/>
-            <w:r>
-              <w:t xml:space="preserve"> </w:t>
-            </w:r>
-            <w:proofErr w:type="gramStart"/>
-            <w:r>
-              <w:t>Methode(</w:t>
-            </w:r>
-            <w:proofErr w:type="gramEnd"/>
-            <w:r>
-              <w:t>)</w:t>
+            <w:r>
+              <w:t>Int Methode()</w:t>
             </w:r>
             <w:r>
               <w:br/>
@@ -296,13 +254,8 @@
               <w:cnfStyle w:val="000000100000" w:firstRow="0" w:lastRow="0" w:firstColumn="0" w:lastColumn="0" w:oddVBand="0" w:evenVBand="0" w:oddHBand="1" w:evenHBand="0" w:firstRowFirstColumn="0" w:firstRowLastColumn="0" w:lastRowFirstColumn="0" w:lastRowLastColumn="0"/>
             </w:pPr>
             <w:r>
-              <w:t xml:space="preserve">Mit </w:t>
-            </w:r>
-            <w:proofErr w:type="spellStart"/>
-            <w:r>
-              <w:t>return</w:t>
-            </w:r>
-            <w:proofErr w:type="spellEnd"/>
+              <w:t>Mit return</w:t>
+            </w:r>
           </w:p>
         </w:tc>
       </w:tr>
@@ -375,62 +328,12 @@
               </w:rPr>
               <w:br/>
             </w:r>
-            <w:proofErr w:type="spellStart"/>
-            <w:r>
-              <w:rPr>
-                <w:b w:val="0"/>
-                <w:bCs w:val="0"/>
-              </w:rPr>
-              <w:t>Int</w:t>
-            </w:r>
-            <w:proofErr w:type="spellEnd"/>
-            <w:r>
-              <w:rPr>
-                <w:b w:val="0"/>
-                <w:bCs w:val="0"/>
-              </w:rPr>
-              <w:t xml:space="preserve"> </w:t>
-            </w:r>
-            <w:proofErr w:type="gramStart"/>
-            <w:r>
-              <w:rPr>
-                <w:b w:val="0"/>
-                <w:bCs w:val="0"/>
-              </w:rPr>
-              <w:t>Max(</w:t>
-            </w:r>
-            <w:proofErr w:type="spellStart"/>
-            <w:proofErr w:type="gramEnd"/>
-            <w:r>
-              <w:rPr>
-                <w:b w:val="0"/>
-                <w:bCs w:val="0"/>
-              </w:rPr>
-              <w:t>int</w:t>
-            </w:r>
-            <w:proofErr w:type="spellEnd"/>
-            <w:r>
-              <w:rPr>
-                <w:b w:val="0"/>
-                <w:bCs w:val="0"/>
-              </w:rPr>
-              <w:t xml:space="preserve"> a, </w:t>
-            </w:r>
-            <w:proofErr w:type="spellStart"/>
-            <w:r>
-              <w:rPr>
-                <w:b w:val="0"/>
-                <w:bCs w:val="0"/>
-              </w:rPr>
-              <w:t>int</w:t>
-            </w:r>
-            <w:proofErr w:type="spellEnd"/>
-            <w:r>
-              <w:rPr>
-                <w:b w:val="0"/>
-                <w:bCs w:val="0"/>
-              </w:rPr>
-              <w:t xml:space="preserve"> b)</w:t>
+            <w:r>
+              <w:rPr>
+                <w:b w:val="0"/>
+                <w:bCs w:val="0"/>
+              </w:rPr>
+              <w:t>Int Max(int a, int b)</w:t>
             </w:r>
             <w:r>
               <w:rPr>
@@ -446,23 +349,7 @@
                 <w:bCs w:val="0"/>
               </w:rPr>
               <w:br/>
-              <w:t xml:space="preserve">   </w:t>
-            </w:r>
-            <w:proofErr w:type="spellStart"/>
-            <w:r>
-              <w:rPr>
-                <w:b w:val="0"/>
-                <w:bCs w:val="0"/>
-              </w:rPr>
-              <w:t>return</w:t>
-            </w:r>
-            <w:proofErr w:type="spellEnd"/>
-            <w:r>
-              <w:rPr>
-                <w:b w:val="0"/>
-                <w:bCs w:val="0"/>
-              </w:rPr>
-              <w:t xml:space="preserve"> a &gt; b ? a : b;</w:t>
+              <w:t xml:space="preserve">   return a &gt; b ? a : b;</w:t>
             </w:r>
             <w:r>
               <w:rPr>
@@ -491,29 +378,22 @@
               <w:cnfStyle w:val="000000100000" w:firstRow="0" w:lastRow="0" w:firstColumn="0" w:lastColumn="0" w:oddVBand="0" w:evenVBand="0" w:oddHBand="1" w:evenHBand="0" w:firstRowFirstColumn="0" w:firstRowLastColumn="0" w:lastRowFirstColumn="0" w:lastRowLastColumn="0"/>
             </w:pPr>
             <w:r>
-              <w:t>Va</w:t>
+              <w:t>v</w:t>
+            </w:r>
+            <w:r>
+              <w:t>a</w:t>
             </w:r>
             <w:r>
               <w:t>r</w:t>
             </w:r>
             <w:r>
-              <w:t xml:space="preserve"> </w:t>
-            </w:r>
-            <w:proofErr w:type="spellStart"/>
-            <w:r>
-              <w:t>myMax</w:t>
-            </w:r>
-            <w:proofErr w:type="spellEnd"/>
-            <w:r>
-              <w:t xml:space="preserve"> = </w:t>
-            </w:r>
-            <w:proofErr w:type="gramStart"/>
-            <w:r>
-              <w:t>Mac(</w:t>
-            </w:r>
-            <w:proofErr w:type="gramEnd"/>
-            <w:r>
-              <w:t>10,20);</w:t>
+              <w:t xml:space="preserve"> myMax = Ma</w:t>
+            </w:r>
+            <w:r>
+              <w:t>x</w:t>
+            </w:r>
+            <w:r>
+              <w:t>(10,20);</w:t>
             </w:r>
           </w:p>
         </w:tc>
@@ -524,7 +404,21 @@
             <w:cnfStyle w:val="001000000000" w:firstRow="0" w:lastRow="0" w:firstColumn="1" w:lastColumn="0" w:oddVBand="0" w:evenVBand="0" w:oddHBand="0" w:evenHBand="0" w:firstRowFirstColumn="0" w:firstRowLastColumn="0" w:lastRowFirstColumn="0" w:lastRowLastColumn="0"/>
             <w:tcW w:w="4957" w:type="dxa"/>
           </w:tcPr>
-          <w:p/>
+          <w:p>
+            <w:pPr>
+              <w:rPr>
+                <w:b w:val="0"/>
+                <w:bCs w:val="0"/>
+              </w:rPr>
+            </w:pPr>
+            <w:r>
+              <w:rPr>
+                <w:b w:val="0"/>
+                <w:bCs w:val="0"/>
+              </w:rPr>
+              <w:t>Was sind Parameter einer Methode und wie werden sie übergeben.</w:t>
+            </w:r>
+          </w:p>
         </w:tc>
         <w:tc>
           <w:tcPr>
@@ -553,6 +447,13 @@
                 <w:bCs w:val="0"/>
               </w:rPr>
             </w:pPr>
+            <w:r>
+              <w:rPr>
+                <w:b w:val="0"/>
+                <w:bCs w:val="0"/>
+              </w:rPr>
+              <w:t>Wie könnte eine Methode aussehen, die auf ein Schaltjahr prüft.</w:t>
+            </w:r>
           </w:p>
         </w:tc>
         <w:tc>
@@ -561,8 +462,72 @@
           </w:tcPr>
           <w:p>
             <w:pPr>
+              <w:spacing w:after="0" w:line="240" w:lineRule="auto"/>
               <w:cnfStyle w:val="000000100000" w:firstRow="0" w:lastRow="0" w:firstColumn="0" w:lastColumn="0" w:oddVBand="0" w:evenVBand="0" w:oddHBand="1" w:evenHBand="0" w:firstRowFirstColumn="0" w:firstRowLastColumn="0" w:lastRowFirstColumn="0" w:lastRowLastColumn="0"/>
-            </w:pPr>
+              <w:rPr>
+                <w:lang w:val="en-US"/>
+              </w:rPr>
+            </w:pPr>
+            <w:r>
+              <w:rPr>
+                <w:lang w:val="en-US"/>
+              </w:rPr>
+              <w:t>bool IsLeapYear(int year)</w:t>
+            </w:r>
+          </w:p>
+          <w:p>
+            <w:pPr>
+              <w:spacing w:after="0" w:line="240" w:lineRule="auto"/>
+              <w:cnfStyle w:val="000000100000" w:firstRow="0" w:lastRow="0" w:firstColumn="0" w:lastColumn="0" w:oddVBand="0" w:evenVBand="0" w:oddHBand="1" w:evenHBand="0" w:firstRowFirstColumn="0" w:firstRowLastColumn="0" w:lastRowFirstColumn="0" w:lastRowLastColumn="0"/>
+              <w:rPr>
+                <w:lang w:val="en-US"/>
+              </w:rPr>
+            </w:pPr>
+            <w:r>
+              <w:rPr>
+                <w:lang w:val="en-US"/>
+              </w:rPr>
+              <w:t>{</w:t>
+            </w:r>
+          </w:p>
+          <w:p>
+            <w:pPr>
+              <w:spacing w:after="0" w:line="240" w:lineRule="auto"/>
+              <w:cnfStyle w:val="000000100000" w:firstRow="0" w:lastRow="0" w:firstColumn="0" w:lastColumn="0" w:oddVBand="0" w:evenVBand="0" w:oddHBand="1" w:evenHBand="0" w:firstRowFirstColumn="0" w:firstRowLastColumn="0" w:lastRowFirstColumn="0" w:lastRowLastColumn="0"/>
+              <w:rPr>
+                <w:lang w:val="en-US"/>
+              </w:rPr>
+            </w:pPr>
+            <w:r>
+              <w:rPr>
+                <w:lang w:val="en-US"/>
+              </w:rPr>
+              <w:t xml:space="preserve">    return (year % 4 == 0) &amp;&amp;</w:t>
+            </w:r>
+          </w:p>
+          <w:p>
+            <w:pPr>
+              <w:spacing w:after="0" w:line="240" w:lineRule="auto"/>
+              <w:cnfStyle w:val="000000100000" w:firstRow="0" w:lastRow="0" w:firstColumn="0" w:lastColumn="0" w:oddVBand="0" w:evenVBand="0" w:oddHBand="1" w:evenHBand="0" w:firstRowFirstColumn="0" w:firstRowLastColumn="0" w:lastRowFirstColumn="0" w:lastRowLastColumn="0"/>
+            </w:pPr>
+            <w:r>
+              <w:rPr>
+                <w:lang w:val="en-US"/>
+              </w:rPr>
+              <w:t xml:space="preserve">           </w:t>
+            </w:r>
+            <w:r>
+              <w:t>(!(year % 100 == 0) || (year % 400 == 0));</w:t>
+            </w:r>
+          </w:p>
+          <w:p>
+            <w:pPr>
+              <w:spacing w:after="0" w:line="240" w:lineRule="auto"/>
+              <w:cnfStyle w:val="000000100000" w:firstRow="0" w:lastRow="0" w:firstColumn="0" w:lastColumn="0" w:oddVBand="0" w:evenVBand="0" w:oddHBand="1" w:evenHBand="0" w:firstRowFirstColumn="0" w:firstRowLastColumn="0" w:lastRowFirstColumn="0" w:lastRowLastColumn="0"/>
+            </w:pPr>
+            <w:r>
+              <w:t>}</w:t>
+            </w:r>
           </w:p>
         </w:tc>
       </w:tr>
@@ -572,7 +537,21 @@
             <w:cnfStyle w:val="001000000000" w:firstRow="0" w:lastRow="0" w:firstColumn="1" w:lastColumn="0" w:oddVBand="0" w:evenVBand="0" w:oddHBand="0" w:evenHBand="0" w:firstRowFirstColumn="0" w:firstRowLastColumn="0" w:lastRowFirstColumn="0" w:lastRowLastColumn="0"/>
             <w:tcW w:w="4957" w:type="dxa"/>
           </w:tcPr>
-          <w:p/>
+          <w:p>
+            <w:pPr>
+              <w:rPr>
+                <w:b w:val="0"/>
+                <w:bCs w:val="0"/>
+              </w:rPr>
+            </w:pPr>
+            <w:r>
+              <w:rPr>
+                <w:b w:val="0"/>
+                <w:bCs w:val="0"/>
+              </w:rPr>
+              <w:t>Namenskonventionen für Methoden und Parameter</w:t>
+            </w:r>
+          </w:p>
         </w:tc>
         <w:tc>
           <w:tcPr>
@@ -581,9 +560,334 @@
           <w:p>
             <w:pPr>
               <w:cnfStyle w:val="000000000000" w:firstRow="0" w:lastRow="0" w:firstColumn="0" w:lastColumn="0" w:oddVBand="0" w:evenVBand="0" w:oddHBand="0" w:evenHBand="0" w:firstRowFirstColumn="0" w:firstRowLastColumn="0" w:lastRowFirstColumn="0" w:lastRowLastColumn="0"/>
-              <w:rPr>
-                <w:rFonts w:ascii="Courier New" w:hAnsi="Courier New" w:cs="Courier New"/>
-              </w:rPr>
+            </w:pPr>
+            <w:r>
+              <w:t>CamelCase</w:t>
+            </w:r>
+          </w:p>
+        </w:tc>
+      </w:tr>
+      <w:tr>
+        <w:trPr>
+          <w:cnfStyle w:val="000000100000" w:firstRow="0" w:lastRow="0" w:firstColumn="0" w:lastColumn="0" w:oddVBand="0" w:evenVBand="0" w:oddHBand="1" w:evenHBand="0" w:firstRowFirstColumn="0" w:firstRowLastColumn="0" w:lastRowFirstColumn="0" w:lastRowLastColumn="0"/>
+        </w:trPr>
+        <w:tc>
+          <w:tcPr>
+            <w:cnfStyle w:val="001000000000" w:firstRow="0" w:lastRow="0" w:firstColumn="1" w:lastColumn="0" w:oddVBand="0" w:evenVBand="0" w:oddHBand="0" w:evenHBand="0" w:firstRowFirstColumn="0" w:firstRowLastColumn="0" w:lastRowFirstColumn="0" w:lastRowLastColumn="0"/>
+            <w:tcW w:w="4957" w:type="dxa"/>
+          </w:tcPr>
+          <w:p>
+            <w:pPr>
+              <w:spacing w:after="0" w:line="240" w:lineRule="auto"/>
+              <w:rPr>
+                <w:lang w:val="en-US"/>
+              </w:rPr>
+            </w:pPr>
+            <w:r>
+              <w:rPr>
+                <w:b w:val="0"/>
+                <w:bCs w:val="0"/>
+                <w:lang w:val="en-US"/>
+              </w:rPr>
+              <w:t xml:space="preserve">void </w:t>
+            </w:r>
+            <w:r>
+              <w:rPr>
+                <w:b w:val="0"/>
+                <w:bCs w:val="0"/>
+                <w:lang w:val="en-US"/>
+              </w:rPr>
+              <w:t>Print</w:t>
+            </w:r>
+            <w:r>
+              <w:rPr>
+                <w:b w:val="0"/>
+                <w:bCs w:val="0"/>
+                <w:lang w:val="en-US"/>
+              </w:rPr>
+              <w:t>(string message, int value)</w:t>
+            </w:r>
+            <w:r>
+              <w:rPr>
+                <w:b w:val="0"/>
+                <w:bCs w:val="0"/>
+                <w:lang w:val="en-US"/>
+              </w:rPr>
+              <w:br/>
+              <w:t>{</w:t>
+            </w:r>
+          </w:p>
+          <w:p>
+            <w:pPr>
+              <w:spacing w:after="0" w:line="240" w:lineRule="auto"/>
+              <w:rPr>
+                <w:b w:val="0"/>
+                <w:bCs w:val="0"/>
+                <w:lang w:val="en-US"/>
+              </w:rPr>
+            </w:pPr>
+            <w:r>
+              <w:rPr>
+                <w:b w:val="0"/>
+                <w:bCs w:val="0"/>
+                <w:lang w:val="en-US"/>
+              </w:rPr>
+              <w:t xml:space="preserve">  </w:t>
+            </w:r>
+            <w:r>
+              <w:rPr>
+                <w:b w:val="0"/>
+                <w:bCs w:val="0"/>
+                <w:lang w:val="en-US"/>
+              </w:rPr>
+              <w:t>Console.Write($”{message}-{value}”);</w:t>
+            </w:r>
+          </w:p>
+          <w:p>
+            <w:pPr>
+              <w:spacing w:after="0" w:line="240" w:lineRule="auto"/>
+              <w:rPr>
+                <w:b w:val="0"/>
+                <w:bCs w:val="0"/>
+                <w:lang w:val="en-US"/>
+              </w:rPr>
+            </w:pPr>
+            <w:r>
+              <w:rPr>
+                <w:b w:val="0"/>
+                <w:bCs w:val="0"/>
+                <w:lang w:val="en-US"/>
+              </w:rPr>
+              <w:t xml:space="preserve"> </w:t>
+            </w:r>
+            <w:r>
+              <w:rPr>
+                <w:b w:val="0"/>
+                <w:bCs w:val="0"/>
+                <w:lang w:val="en-US"/>
+              </w:rPr>
+              <w:t xml:space="preserve"> </w:t>
+            </w:r>
+            <w:r>
+              <w:rPr>
+                <w:b w:val="0"/>
+                <w:bCs w:val="0"/>
+                <w:lang w:val="en-US"/>
+              </w:rPr>
+              <w:t>value = 10;</w:t>
+            </w:r>
+          </w:p>
+          <w:p>
+            <w:pPr>
+              <w:spacing w:after="0" w:line="240" w:lineRule="auto"/>
+              <w:rPr>
+                <w:b w:val="0"/>
+                <w:bCs w:val="0"/>
+                <w:lang w:val="en-US"/>
+              </w:rPr>
+            </w:pPr>
+            <w:r>
+              <w:rPr>
+                <w:b w:val="0"/>
+                <w:bCs w:val="0"/>
+                <w:lang w:val="en-US"/>
+              </w:rPr>
+              <w:t xml:space="preserve">  </w:t>
+            </w:r>
+            <w:r>
+              <w:rPr>
+                <w:b w:val="0"/>
+                <w:bCs w:val="0"/>
+                <w:lang w:val="en-US"/>
+              </w:rPr>
+              <w:t>message = “Hallo Welt”;</w:t>
+            </w:r>
+          </w:p>
+          <w:p>
+            <w:pPr>
+              <w:spacing w:after="0" w:line="240" w:lineRule="auto"/>
+              <w:rPr>
+                <w:lang w:val="en-US"/>
+              </w:rPr>
+            </w:pPr>
+            <w:r>
+              <w:rPr>
+                <w:b w:val="0"/>
+                <w:bCs w:val="0"/>
+                <w:lang w:val="en-US"/>
+              </w:rPr>
+              <w:t xml:space="preserve">  </w:t>
+            </w:r>
+            <w:r>
+              <w:rPr>
+                <w:b w:val="0"/>
+                <w:bCs w:val="0"/>
+                <w:lang w:val="en-US"/>
+              </w:rPr>
+              <w:t>Console.Write($”{message}-{value}”);</w:t>
+            </w:r>
+          </w:p>
+          <w:p>
+            <w:pPr>
+              <w:spacing w:after="0" w:line="240" w:lineRule="auto"/>
+              <w:rPr>
+                <w:b w:val="0"/>
+                <w:bCs w:val="0"/>
+                <w:lang w:val="en-US"/>
+              </w:rPr>
+            </w:pPr>
+            <w:r>
+              <w:rPr>
+                <w:b w:val="0"/>
+                <w:bCs w:val="0"/>
+                <w:lang w:val="en-US"/>
+              </w:rPr>
+              <w:lastRenderedPageBreak/>
+              <w:t xml:space="preserve">} </w:t>
+            </w:r>
+          </w:p>
+          <w:p>
+            <w:pPr>
+              <w:spacing w:after="0" w:line="240" w:lineRule="auto"/>
+              <w:rPr>
+                <w:b w:val="0"/>
+                <w:bCs w:val="0"/>
+                <w:lang w:val="en-US"/>
+              </w:rPr>
+            </w:pPr>
+          </w:p>
+          <w:p>
+            <w:pPr>
+              <w:spacing w:after="0" w:line="240" w:lineRule="auto"/>
+              <w:rPr>
+                <w:b w:val="0"/>
+                <w:bCs w:val="0"/>
+                <w:lang w:val="en-US"/>
+              </w:rPr>
+            </w:pPr>
+            <w:r>
+              <w:rPr>
+                <w:b w:val="0"/>
+                <w:bCs w:val="0"/>
+                <w:lang w:val="en-US"/>
+              </w:rPr>
+              <w:t>string message = “Hallo world”;</w:t>
+            </w:r>
+          </w:p>
+          <w:p>
+            <w:pPr>
+              <w:spacing w:after="0" w:line="240" w:lineRule="auto"/>
+              <w:rPr>
+                <w:b w:val="0"/>
+                <w:bCs w:val="0"/>
+                <w:lang w:val="en-US"/>
+              </w:rPr>
+            </w:pPr>
+            <w:r>
+              <w:rPr>
+                <w:b w:val="0"/>
+                <w:bCs w:val="0"/>
+                <w:lang w:val="en-US"/>
+              </w:rPr>
+              <w:t xml:space="preserve">int </w:t>
+            </w:r>
+            <w:r>
+              <w:rPr>
+                <w:b w:val="0"/>
+                <w:bCs w:val="0"/>
+                <w:lang w:val="en-US"/>
+              </w:rPr>
+              <w:t>value = 11;</w:t>
+            </w:r>
+          </w:p>
+          <w:p>
+            <w:pPr>
+              <w:spacing w:after="0" w:line="240" w:lineRule="auto"/>
+              <w:rPr>
+                <w:b w:val="0"/>
+                <w:bCs w:val="0"/>
+                <w:lang w:val="en-US"/>
+              </w:rPr>
+            </w:pPr>
+            <w:r>
+              <w:rPr>
+                <w:b w:val="0"/>
+                <w:bCs w:val="0"/>
+                <w:lang w:val="en-US"/>
+              </w:rPr>
+              <w:t>Print</w:t>
+            </w:r>
+            <w:r>
+              <w:rPr>
+                <w:b w:val="0"/>
+                <w:bCs w:val="0"/>
+                <w:lang w:val="en-US"/>
+              </w:rPr>
+              <w:t>(message,value);</w:t>
+            </w:r>
+          </w:p>
+          <w:p>
+            <w:pPr>
+              <w:spacing w:after="0" w:line="240" w:lineRule="auto"/>
+              <w:rPr>
+                <w:b w:val="0"/>
+                <w:bCs w:val="0"/>
+                <w:lang w:val="en-US"/>
+              </w:rPr>
+            </w:pPr>
+            <w:r>
+              <w:rPr>
+                <w:b w:val="0"/>
+                <w:bCs w:val="0"/>
+                <w:lang w:val="en-US"/>
+              </w:rPr>
+              <w:t>Console.Write($”{message}-{value}”);</w:t>
+            </w:r>
+          </w:p>
+        </w:tc>
+        <w:tc>
+          <w:tcPr>
+            <w:tcW w:w="4815" w:type="dxa"/>
+          </w:tcPr>
+          <w:p>
+            <w:pPr>
+              <w:cnfStyle w:val="000000100000" w:firstRow="0" w:lastRow="0" w:firstColumn="0" w:lastColumn="0" w:oddVBand="0" w:evenVBand="0" w:oddHBand="1" w:evenHBand="0" w:firstRowFirstColumn="0" w:firstRowLastColumn="0" w:lastRowFirstColumn="0" w:lastRowLastColumn="0"/>
+              <w:rPr>
+                <w:lang w:val="en-US"/>
+              </w:rPr>
+            </w:pPr>
+            <w:r>
+              <w:rPr>
+                <w:lang w:val="en-US"/>
+              </w:rPr>
+              <w:lastRenderedPageBreak/>
+              <w:t>Siehe *.txt</w:t>
+            </w:r>
+          </w:p>
+        </w:tc>
+      </w:tr>
+      <w:tr>
+        <w:tc>
+          <w:tcPr>
+            <w:cnfStyle w:val="001000000000" w:firstRow="0" w:lastRow="0" w:firstColumn="1" w:lastColumn="0" w:oddVBand="0" w:evenVBand="0" w:oddHBand="0" w:evenHBand="0" w:firstRowFirstColumn="0" w:firstRowLastColumn="0" w:lastRowFirstColumn="0" w:lastRowLastColumn="0"/>
+            <w:tcW w:w="4957" w:type="dxa"/>
+          </w:tcPr>
+          <w:p>
+            <w:pPr>
+              <w:rPr>
+                <w:b w:val="0"/>
+                <w:bCs w:val="0"/>
+              </w:rPr>
+            </w:pPr>
+          </w:p>
+        </w:tc>
+        <w:tc>
+          <w:tcPr>
+            <w:tcW w:w="4815" w:type="dxa"/>
+          </w:tcPr>
+          <w:p>
+            <w:pPr>
+              <w:cnfStyle w:val="000000000000" w:firstRow="0" w:lastRow="0" w:firstColumn="0" w:lastColumn="0" w:oddVBand="0" w:evenVBand="0" w:oddHBand="0" w:evenHBand="0" w:firstRowFirstColumn="0" w:firstRowLastColumn="0" w:lastRowFirstColumn="0" w:lastRowLastColumn="0"/>
             </w:pPr>
           </w:p>
         </w:tc>
@@ -606,6 +910,9 @@
           <w:p>
             <w:pPr>
               <w:cnfStyle w:val="000000100000" w:firstRow="0" w:lastRow="0" w:firstColumn="0" w:lastColumn="0" w:oddVBand="0" w:evenVBand="0" w:oddHBand="1" w:evenHBand="0" w:firstRowFirstColumn="0" w:firstRowLastColumn="0" w:lastRowFirstColumn="0" w:lastRowLastColumn="0"/>
+              <w:rPr>
+                <w:rFonts w:ascii="Courier New" w:hAnsi="Courier New" w:cs="Courier New"/>
+              </w:rPr>
             </w:pPr>
           </w:p>
         </w:tc>
@@ -647,10 +954,6 @@
           <w:p>
             <w:pPr>
               <w:cnfStyle w:val="000000100000" w:firstRow="0" w:lastRow="0" w:firstColumn="0" w:lastColumn="0" w:oddVBand="0" w:evenVBand="0" w:oddHBand="1" w:evenHBand="0" w:firstRowFirstColumn="0" w:firstRowLastColumn="0" w:lastRowFirstColumn="0" w:lastRowLastColumn="0"/>
-              <w:rPr>
-                <w:rFonts w:ascii="Courier New" w:hAnsi="Courier New" w:cs="Courier New"/>
-                <w:lang w:val="en-US"/>
-              </w:rPr>
             </w:pPr>
           </w:p>
         </w:tc>
@@ -672,7 +975,6 @@
               <w:cnfStyle w:val="000000000000" w:firstRow="0" w:lastRow="0" w:firstColumn="0" w:lastColumn="0" w:oddVBand="0" w:evenVBand="0" w:oddHBand="0" w:evenHBand="0" w:firstRowFirstColumn="0" w:firstRowLastColumn="0" w:lastRowFirstColumn="0" w:lastRowLastColumn="0"/>
               <w:rPr>
                 <w:rFonts w:ascii="Courier New" w:hAnsi="Courier New" w:cs="Courier New"/>
-                <w:lang w:val="en-US"/>
               </w:rPr>
             </w:pPr>
           </w:p>
@@ -698,20 +1000,35 @@
               <w:cnfStyle w:val="000000100000" w:firstRow="0" w:lastRow="0" w:firstColumn="0" w:lastColumn="0" w:oddVBand="0" w:evenVBand="0" w:oddHBand="1" w:evenHBand="0" w:firstRowFirstColumn="0" w:firstRowLastColumn="0" w:lastRowFirstColumn="0" w:lastRowLastColumn="0"/>
               <w:rPr>
                 <w:rFonts w:ascii="Courier New" w:hAnsi="Courier New" w:cs="Courier New"/>
-                <w:lang w:val="en-US"/>
+              </w:rPr>
+            </w:pPr>
+          </w:p>
+        </w:tc>
+      </w:tr>
+      <w:tr>
+        <w:tc>
+          <w:tcPr>
+            <w:cnfStyle w:val="001000000000" w:firstRow="0" w:lastRow="0" w:firstColumn="1" w:lastColumn="0" w:oddVBand="0" w:evenVBand="0" w:oddHBand="0" w:evenHBand="0" w:firstRowFirstColumn="0" w:firstRowLastColumn="0" w:lastRowFirstColumn="0" w:lastRowLastColumn="0"/>
+            <w:tcW w:w="4957" w:type="dxa"/>
+          </w:tcPr>
+          <w:p/>
+        </w:tc>
+        <w:tc>
+          <w:tcPr>
+            <w:tcW w:w="4815" w:type="dxa"/>
+          </w:tcPr>
+          <w:p>
+            <w:pPr>
+              <w:cnfStyle w:val="000000000000" w:firstRow="0" w:lastRow="0" w:firstColumn="0" w:lastColumn="0" w:oddVBand="0" w:evenVBand="0" w:oddHBand="0" w:evenHBand="0" w:firstRowFirstColumn="0" w:firstRowLastColumn="0" w:lastRowFirstColumn="0" w:lastRowLastColumn="0"/>
+              <w:rPr>
+                <w:rFonts w:ascii="Courier New" w:hAnsi="Courier New" w:cs="Courier New"/>
               </w:rPr>
             </w:pPr>
           </w:p>
         </w:tc>
       </w:tr>
     </w:tbl>
-    <w:p>
-      <w:pPr>
-        <w:rPr>
-          <w:lang w:val="en-US"/>
-        </w:rPr>
-      </w:pPr>
-    </w:p>
+    <w:p/>
     <w:sectPr>
       <w:headerReference w:type="default" r:id="rId8"/>
       <w:footerReference w:type="default" r:id="rId9"/>

</xml_diff>

<commit_message>
Move 07 => 08
</commit_message>
<xml_diff>
--- a/07_Methoden/07_Mitarbeitsfrage.docx
+++ b/07_Methoden/07_Mitarbeitsfrage.docx
@@ -879,6 +879,20 @@
                 <w:bCs w:val="0"/>
               </w:rPr>
             </w:pPr>
+            <w:r>
+              <w:rPr>
+                <w:b w:val="0"/>
+                <w:bCs w:val="0"/>
+              </w:rPr>
+              <w:t>Kann man die Parameter einer Methode ändern?</w:t>
+            </w:r>
+            <w:r>
+              <w:rPr>
+                <w:b w:val="0"/>
+                <w:bCs w:val="0"/>
+              </w:rPr>
+              <w:t xml:space="preserve"> Was muss man ändern, um Parameter beim Aufrufer ebenfalls zu ändern.</w:t>
+            </w:r>
           </w:p>
         </w:tc>
         <w:tc>
@@ -889,6 +903,9 @@
             <w:pPr>
               <w:cnfStyle w:val="000000000000" w:firstRow="0" w:lastRow="0" w:firstColumn="0" w:lastColumn="0" w:oddVBand="0" w:evenVBand="0" w:oddHBand="0" w:evenHBand="0" w:firstRowFirstColumn="0" w:firstRowLastColumn="0" w:lastRowFirstColumn="0" w:lastRowLastColumn="0"/>
             </w:pPr>
+            <w:r>
+              <w:t>CallByValue</w:t>
+            </w:r>
           </w:p>
         </w:tc>
       </w:tr>
@@ -901,7 +918,29 @@
             <w:cnfStyle w:val="001000000000" w:firstRow="0" w:lastRow="0" w:firstColumn="1" w:lastColumn="0" w:oddVBand="0" w:evenVBand="0" w:oddHBand="0" w:evenHBand="0" w:firstRowFirstColumn="0" w:firstRowLastColumn="0" w:lastRowFirstColumn="0" w:lastRowLastColumn="0"/>
             <w:tcW w:w="4957" w:type="dxa"/>
           </w:tcPr>
-          <w:p/>
+          <w:p>
+            <w:pPr>
+              <w:rPr>
+                <w:b w:val="0"/>
+                <w:bCs w:val="0"/>
+              </w:rPr>
+            </w:pPr>
+            <w:r>
+              <w:rPr>
+                <w:b w:val="0"/>
+                <w:bCs w:val="0"/>
+              </w:rPr>
+              <w:t xml:space="preserve">Implementiere eine Methode </w:t>
+            </w:r>
+            <w:r>
+              <w:rPr>
+                <w:b w:val="0"/>
+                <w:bCs w:val="0"/>
+              </w:rPr>
+              <w:br/>
+              <w:t xml:space="preserve">Middle </w:t>
+            </w:r>
+          </w:p>
         </w:tc>
         <w:tc>
           <w:tcPr>
@@ -912,8 +951,61 @@
               <w:cnfStyle w:val="000000100000" w:firstRow="0" w:lastRow="0" w:firstColumn="0" w:lastColumn="0" w:oddVBand="0" w:evenVBand="0" w:oddHBand="1" w:evenHBand="0" w:firstRowFirstColumn="0" w:firstRowLastColumn="0" w:lastRowFirstColumn="0" w:lastRowLastColumn="0"/>
               <w:rPr>
                 <w:rFonts w:ascii="Courier New" w:hAnsi="Courier New" w:cs="Courier New"/>
-              </w:rPr>
-            </w:pPr>
+                <w:lang w:val="en-US"/>
+              </w:rPr>
+            </w:pPr>
+            <w:r>
+              <w:rPr>
+                <w:rFonts w:ascii="Courier New" w:hAnsi="Courier New" w:cs="Courier New"/>
+                <w:lang w:val="en-US"/>
+              </w:rPr>
+              <w:t>i</w:t>
+            </w:r>
+            <w:r>
+              <w:rPr>
+                <w:rFonts w:ascii="Courier New" w:hAnsi="Courier New" w:cs="Courier New"/>
+                <w:lang w:val="en-US"/>
+              </w:rPr>
+              <w:t>nt Middly(int a, i</w:t>
+            </w:r>
+            <w:r>
+              <w:rPr>
+                <w:rFonts w:ascii="Courier New" w:hAnsi="Courier New" w:cs="Courier New"/>
+                <w:lang w:val="en-US"/>
+              </w:rPr>
+              <w:t>nt b)</w:t>
+            </w:r>
+            <w:r>
+              <w:rPr>
+                <w:rFonts w:ascii="Courier New" w:hAnsi="Courier New" w:cs="Courier New"/>
+                <w:lang w:val="en-US"/>
+              </w:rPr>
+              <w:br/>
+              <w:t>{</w:t>
+            </w:r>
+            <w:r>
+              <w:rPr>
+                <w:rFonts w:ascii="Courier New" w:hAnsi="Courier New" w:cs="Courier New"/>
+                <w:lang w:val="en-US"/>
+              </w:rPr>
+              <w:br/>
+              <w:t xml:space="preserve">   return (a+b) / 2</w:t>
+            </w:r>
+            <w:r>
+              <w:rPr>
+                <w:rFonts w:ascii="Courier New" w:hAnsi="Courier New" w:cs="Courier New"/>
+                <w:lang w:val="en-US"/>
+              </w:rPr>
+              <w:t>;</w:t>
+            </w:r>
+            <w:r>
+              <w:rPr>
+                <w:rFonts w:ascii="Courier New" w:hAnsi="Courier New" w:cs="Courier New"/>
+                <w:lang w:val="en-US"/>
+              </w:rPr>
+              <w:br/>
+              <w:t>}</w:t>
+            </w:r>
           </w:p>
         </w:tc>
       </w:tr>
@@ -923,7 +1015,31 @@
             <w:cnfStyle w:val="001000000000" w:firstRow="0" w:lastRow="0" w:firstColumn="1" w:lastColumn="0" w:oddVBand="0" w:evenVBand="0" w:oddHBand="0" w:evenHBand="0" w:firstRowFirstColumn="0" w:firstRowLastColumn="0" w:lastRowFirstColumn="0" w:lastRowLastColumn="0"/>
             <w:tcW w:w="4957" w:type="dxa"/>
           </w:tcPr>
-          <w:p/>
+          <w:p>
+            <w:pPr>
+              <w:rPr>
+                <w:b w:val="0"/>
+                <w:bCs w:val="0"/>
+                <w:lang w:val="en-US"/>
+              </w:rPr>
+            </w:pPr>
+            <w:r>
+              <w:rPr>
+                <w:b w:val="0"/>
+                <w:bCs w:val="0"/>
+                <w:lang w:val="en-US"/>
+              </w:rPr>
+              <w:t>String Methode</w:t>
+            </w:r>
+            <w:r>
+              <w:rPr>
+                <w:b w:val="0"/>
+                <w:bCs w:val="0"/>
+                <w:lang w:val="en-US"/>
+              </w:rPr>
+              <w:t>: Contains</w:t>
+            </w:r>
+          </w:p>
         </w:tc>
         <w:tc>
           <w:tcPr>
@@ -932,6 +1048,9 @@
           <w:p>
             <w:pPr>
               <w:cnfStyle w:val="000000000000" w:firstRow="0" w:lastRow="0" w:firstColumn="0" w:lastColumn="0" w:oddVBand="0" w:evenVBand="0" w:oddHBand="0" w:evenHBand="0" w:firstRowFirstColumn="0" w:firstRowLastColumn="0" w:lastRowFirstColumn="0" w:lastRowLastColumn="0"/>
+              <w:rPr>
+                <w:lang w:val="en-US"/>
+              </w:rPr>
             </w:pPr>
           </w:p>
         </w:tc>
@@ -945,7 +1064,40 @@
             <w:cnfStyle w:val="001000000000" w:firstRow="0" w:lastRow="0" w:firstColumn="1" w:lastColumn="0" w:oddVBand="0" w:evenVBand="0" w:oddHBand="0" w:evenHBand="0" w:firstRowFirstColumn="0" w:firstRowLastColumn="0" w:lastRowFirstColumn="0" w:lastRowLastColumn="0"/>
             <w:tcW w:w="4957" w:type="dxa"/>
           </w:tcPr>
-          <w:p/>
+          <w:p>
+            <w:pPr>
+              <w:rPr>
+                <w:b w:val="0"/>
+                <w:bCs w:val="0"/>
+                <w:lang w:val="en-US"/>
+              </w:rPr>
+            </w:pPr>
+            <w:r>
+              <w:rPr>
+                <w:b w:val="0"/>
+                <w:bCs w:val="0"/>
+                <w:lang w:val="en-US"/>
+              </w:rPr>
+              <w:t xml:space="preserve">String Methode: </w:t>
+            </w:r>
+            <w:r>
+              <w:rPr>
+                <w:b w:val="0"/>
+                <w:bCs w:val="0"/>
+                <w:lang w:val="en-US"/>
+              </w:rPr>
+              <w:t>IndexOf, LastIndexOf</w:t>
+            </w:r>
+            <w:r>
+              <w:rPr>
+                <w:b w:val="0"/>
+                <w:bCs w:val="0"/>
+                <w:lang w:val="en-US"/>
+              </w:rPr>
+              <w:br/>
+              <w:t>Mit startIdx, count</w:t>
+            </w:r>
+          </w:p>
         </w:tc>
         <w:tc>
           <w:tcPr>
@@ -954,6 +1106,9 @@
           <w:p>
             <w:pPr>
               <w:cnfStyle w:val="000000100000" w:firstRow="0" w:lastRow="0" w:firstColumn="0" w:lastColumn="0" w:oddVBand="0" w:evenVBand="0" w:oddHBand="1" w:evenHBand="0" w:firstRowFirstColumn="0" w:firstRowLastColumn="0" w:lastRowFirstColumn="0" w:lastRowLastColumn="0"/>
+              <w:rPr>
+                <w:lang w:val="en-US"/>
+              </w:rPr>
             </w:pPr>
           </w:p>
         </w:tc>
@@ -964,7 +1119,32 @@
             <w:cnfStyle w:val="001000000000" w:firstRow="0" w:lastRow="0" w:firstColumn="1" w:lastColumn="0" w:oddVBand="0" w:evenVBand="0" w:oddHBand="0" w:evenHBand="0" w:firstRowFirstColumn="0" w:firstRowLastColumn="0" w:lastRowFirstColumn="0" w:lastRowLastColumn="0"/>
             <w:tcW w:w="4957" w:type="dxa"/>
           </w:tcPr>
-          <w:p/>
+          <w:p>
+            <w:pPr>
+              <w:rPr>
+                <w:b w:val="0"/>
+                <w:bCs w:val="0"/>
+                <w:lang w:val="en-US"/>
+              </w:rPr>
+            </w:pPr>
+            <w:r>
+              <w:rPr>
+                <w:b w:val="0"/>
+                <w:bCs w:val="0"/>
+                <w:lang w:val="en-US"/>
+              </w:rPr>
+              <w:t>String Methoden: SubString</w:t>
+            </w:r>
+            <w:r>
+              <w:rPr>
+                <w:b w:val="0"/>
+                <w:bCs w:val="0"/>
+                <w:lang w:val="en-US"/>
+              </w:rPr>
+              <w:br/>
+              <w:t>Mit startIdx, count</w:t>
+            </w:r>
+          </w:p>
         </w:tc>
         <w:tc>
           <w:tcPr>
@@ -975,6 +1155,7 @@
               <w:cnfStyle w:val="000000000000" w:firstRow="0" w:lastRow="0" w:firstColumn="0" w:lastColumn="0" w:oddVBand="0" w:evenVBand="0" w:oddHBand="0" w:evenHBand="0" w:firstRowFirstColumn="0" w:firstRowLastColumn="0" w:lastRowFirstColumn="0" w:lastRowLastColumn="0"/>
               <w:rPr>
                 <w:rFonts w:ascii="Courier New" w:hAnsi="Courier New" w:cs="Courier New"/>
+                <w:lang w:val="en-US"/>
               </w:rPr>
             </w:pPr>
           </w:p>
@@ -989,7 +1170,72 @@
             <w:cnfStyle w:val="001000000000" w:firstRow="0" w:lastRow="0" w:firstColumn="1" w:lastColumn="0" w:oddVBand="0" w:evenVBand="0" w:oddHBand="0" w:evenHBand="0" w:firstRowFirstColumn="0" w:firstRowLastColumn="0" w:lastRowFirstColumn="0" w:lastRowLastColumn="0"/>
             <w:tcW w:w="4957" w:type="dxa"/>
           </w:tcPr>
-          <w:p/>
+          <w:p>
+            <w:pPr>
+              <w:rPr>
+                <w:b w:val="0"/>
+                <w:bCs w:val="0"/>
+                <w:lang w:val="en-US"/>
+              </w:rPr>
+            </w:pPr>
+            <w:r>
+              <w:rPr>
+                <w:b w:val="0"/>
+                <w:bCs w:val="0"/>
+                <w:lang w:val="en-US"/>
+              </w:rPr>
+              <w:t xml:space="preserve">String </w:t>
+            </w:r>
+            <w:r>
+              <w:rPr>
+                <w:b w:val="0"/>
+                <w:bCs w:val="0"/>
+                <w:lang w:val="en-US"/>
+              </w:rPr>
+              <w:t>Methoden:</w:t>
+            </w:r>
+            <w:r>
+              <w:rPr>
+                <w:b w:val="0"/>
+                <w:bCs w:val="0"/>
+                <w:lang w:val="en-US"/>
+              </w:rPr>
+              <w:t xml:space="preserve"> </w:t>
+            </w:r>
+            <w:r>
+              <w:rPr>
+                <w:b w:val="0"/>
+                <w:bCs w:val="0"/>
+                <w:lang w:val="en-US"/>
+              </w:rPr>
+              <w:t>Trim</w:t>
+            </w:r>
+            <w:r>
+              <w:rPr>
+                <w:b w:val="0"/>
+                <w:bCs w:val="0"/>
+                <w:lang w:val="en-US"/>
+              </w:rPr>
+              <w:t>Start</w:t>
+            </w:r>
+            <w:r>
+              <w:rPr>
+                <w:b w:val="0"/>
+                <w:bCs w:val="0"/>
+                <w:lang w:val="en-US"/>
+              </w:rPr>
+              <w:br/>
+              <w:t xml:space="preserve">char </w:t>
+            </w:r>
+            <w:r>
+              <w:rPr>
+                <w:b w:val="0"/>
+                <w:bCs w:val="0"/>
+                <w:lang w:val="en-US"/>
+              </w:rPr>
+              <w:t>ch</w:t>
+            </w:r>
+          </w:p>
         </w:tc>
         <w:tc>
           <w:tcPr>
@@ -1000,6 +1246,7 @@
               <w:cnfStyle w:val="000000100000" w:firstRow="0" w:lastRow="0" w:firstColumn="0" w:lastColumn="0" w:oddVBand="0" w:evenVBand="0" w:oddHBand="1" w:evenHBand="0" w:firstRowFirstColumn="0" w:firstRowLastColumn="0" w:lastRowFirstColumn="0" w:lastRowLastColumn="0"/>
               <w:rPr>
                 <w:rFonts w:ascii="Courier New" w:hAnsi="Courier New" w:cs="Courier New"/>
+                <w:lang w:val="en-US"/>
               </w:rPr>
             </w:pPr>
           </w:p>
@@ -1011,7 +1258,55 @@
             <w:cnfStyle w:val="001000000000" w:firstRow="0" w:lastRow="0" w:firstColumn="1" w:lastColumn="0" w:oddVBand="0" w:evenVBand="0" w:oddHBand="0" w:evenHBand="0" w:firstRowFirstColumn="0" w:firstRowLastColumn="0" w:lastRowFirstColumn="0" w:lastRowLastColumn="0"/>
             <w:tcW w:w="4957" w:type="dxa"/>
           </w:tcPr>
-          <w:p/>
+          <w:p>
+            <w:pPr>
+              <w:rPr>
+                <w:b w:val="0"/>
+                <w:bCs w:val="0"/>
+                <w:lang w:val="en-US"/>
+              </w:rPr>
+            </w:pPr>
+            <w:r>
+              <w:rPr>
+                <w:b w:val="0"/>
+                <w:bCs w:val="0"/>
+                <w:lang w:val="en-US"/>
+              </w:rPr>
+              <w:t xml:space="preserve">String </w:t>
+            </w:r>
+            <w:r>
+              <w:rPr>
+                <w:b w:val="0"/>
+                <w:bCs w:val="0"/>
+                <w:lang w:val="en-US"/>
+              </w:rPr>
+              <w:t>Methoden:</w:t>
+            </w:r>
+            <w:r>
+              <w:rPr>
+                <w:b w:val="0"/>
+                <w:bCs w:val="0"/>
+                <w:lang w:val="en-US"/>
+              </w:rPr>
+              <w:t xml:space="preserve"> </w:t>
+            </w:r>
+            <w:r>
+              <w:rPr>
+                <w:b w:val="0"/>
+                <w:bCs w:val="0"/>
+                <w:lang w:val="en-US"/>
+              </w:rPr>
+              <w:t>Trim</w:t>
+            </w:r>
+            <w:r>
+              <w:rPr>
+                <w:b w:val="0"/>
+                <w:bCs w:val="0"/>
+                <w:lang w:val="en-US"/>
+              </w:rPr>
+              <w:t>End</w:t>
+            </w:r>
+          </w:p>
         </w:tc>
         <w:tc>
           <w:tcPr>
@@ -1022,13 +1317,149 @@
               <w:cnfStyle w:val="000000000000" w:firstRow="0" w:lastRow="0" w:firstColumn="0" w:lastColumn="0" w:oddVBand="0" w:evenVBand="0" w:oddHBand="0" w:evenHBand="0" w:firstRowFirstColumn="0" w:firstRowLastColumn="0" w:lastRowFirstColumn="0" w:lastRowLastColumn="0"/>
               <w:rPr>
                 <w:rFonts w:ascii="Courier New" w:hAnsi="Courier New" w:cs="Courier New"/>
+                <w:lang w:val="en-US"/>
+              </w:rPr>
+            </w:pPr>
+          </w:p>
+        </w:tc>
+      </w:tr>
+      <w:tr>
+        <w:trPr>
+          <w:cnfStyle w:val="000000100000" w:firstRow="0" w:lastRow="0" w:firstColumn="0" w:lastColumn="0" w:oddVBand="0" w:evenVBand="0" w:oddHBand="1" w:evenHBand="0" w:firstRowFirstColumn="0" w:firstRowLastColumn="0" w:lastRowFirstColumn="0" w:lastRowLastColumn="0"/>
+        </w:trPr>
+        <w:tc>
+          <w:tcPr>
+            <w:cnfStyle w:val="001000000000" w:firstRow="0" w:lastRow="0" w:firstColumn="1" w:lastColumn="0" w:oddVBand="0" w:evenVBand="0" w:oddHBand="0" w:evenHBand="0" w:firstRowFirstColumn="0" w:firstRowLastColumn="0" w:lastRowFirstColumn="0" w:lastRowLastColumn="0"/>
+            <w:tcW w:w="4957" w:type="dxa"/>
+          </w:tcPr>
+          <w:p>
+            <w:pPr>
+              <w:rPr>
+                <w:b w:val="0"/>
+                <w:bCs w:val="0"/>
+                <w:lang w:val="en-US"/>
+              </w:rPr>
+            </w:pPr>
+            <w:r>
+              <w:rPr>
+                <w:b w:val="0"/>
+                <w:bCs w:val="0"/>
+                <w:lang w:val="en-US"/>
+              </w:rPr>
+              <w:t xml:space="preserve">String </w:t>
+            </w:r>
+            <w:r>
+              <w:rPr>
+                <w:b w:val="0"/>
+                <w:bCs w:val="0"/>
+                <w:lang w:val="en-US"/>
+              </w:rPr>
+              <w:t>Methoden:</w:t>
+            </w:r>
+            <w:r>
+              <w:rPr>
+                <w:b w:val="0"/>
+                <w:bCs w:val="0"/>
+                <w:lang w:val="en-US"/>
+              </w:rPr>
+              <w:t xml:space="preserve"> </w:t>
+            </w:r>
+            <w:r>
+              <w:rPr>
+                <w:b w:val="0"/>
+                <w:bCs w:val="0"/>
+                <w:lang w:val="en-US"/>
+              </w:rPr>
+              <w:t>Trim</w:t>
+            </w:r>
+          </w:p>
+        </w:tc>
+        <w:tc>
+          <w:tcPr>
+            <w:tcW w:w="4815" w:type="dxa"/>
+          </w:tcPr>
+          <w:p>
+            <w:pPr>
+              <w:cnfStyle w:val="000000100000" w:firstRow="0" w:lastRow="0" w:firstColumn="0" w:lastColumn="0" w:oddVBand="0" w:evenVBand="0" w:oddHBand="1" w:evenHBand="0" w:firstRowFirstColumn="0" w:firstRowLastColumn="0" w:lastRowFirstColumn="0" w:lastRowLastColumn="0"/>
+              <w:rPr>
+                <w:rFonts w:ascii="Courier New" w:hAnsi="Courier New" w:cs="Courier New"/>
+                <w:lang w:val="en-US"/>
+              </w:rPr>
+            </w:pPr>
+          </w:p>
+        </w:tc>
+      </w:tr>
+      <w:tr>
+        <w:tc>
+          <w:tcPr>
+            <w:cnfStyle w:val="001000000000" w:firstRow="0" w:lastRow="0" w:firstColumn="1" w:lastColumn="0" w:oddVBand="0" w:evenVBand="0" w:oddHBand="0" w:evenHBand="0" w:firstRowFirstColumn="0" w:firstRowLastColumn="0" w:lastRowFirstColumn="0" w:lastRowLastColumn="0"/>
+            <w:tcW w:w="4957" w:type="dxa"/>
+          </w:tcPr>
+          <w:p>
+            <w:pPr>
+              <w:rPr>
+                <w:b w:val="0"/>
+                <w:bCs w:val="0"/>
+                <w:lang w:val="en-US"/>
+              </w:rPr>
+            </w:pPr>
+            <w:r>
+              <w:rPr>
+                <w:b w:val="0"/>
+                <w:bCs w:val="0"/>
+                <w:lang w:val="en-US"/>
+              </w:rPr>
+              <w:t xml:space="preserve">String </w:t>
+            </w:r>
+            <w:r>
+              <w:rPr>
+                <w:b w:val="0"/>
+                <w:bCs w:val="0"/>
+                <w:lang w:val="en-US"/>
+              </w:rPr>
+              <w:t>Methoden:</w:t>
+            </w:r>
+            <w:r>
+              <w:rPr>
+                <w:b w:val="0"/>
+                <w:bCs w:val="0"/>
+                <w:lang w:val="en-US"/>
+              </w:rPr>
+              <w:t xml:space="preserve"> </w:t>
+            </w:r>
+            <w:r>
+              <w:rPr>
+                <w:b w:val="0"/>
+                <w:bCs w:val="0"/>
+                <w:lang w:val="en-US"/>
+              </w:rPr>
+              <w:t>StartsWith</w:t>
+            </w:r>
+          </w:p>
+        </w:tc>
+        <w:tc>
+          <w:tcPr>
+            <w:tcW w:w="4815" w:type="dxa"/>
+          </w:tcPr>
+          <w:p>
+            <w:pPr>
+              <w:cnfStyle w:val="000000000000" w:firstRow="0" w:lastRow="0" w:firstColumn="0" w:lastColumn="0" w:oddVBand="0" w:evenVBand="0" w:oddHBand="0" w:evenHBand="0" w:firstRowFirstColumn="0" w:firstRowLastColumn="0" w:lastRowFirstColumn="0" w:lastRowLastColumn="0"/>
+              <w:rPr>
+                <w:rFonts w:ascii="Courier New" w:hAnsi="Courier New" w:cs="Courier New"/>
+                <w:lang w:val="en-US"/>
               </w:rPr>
             </w:pPr>
           </w:p>
         </w:tc>
       </w:tr>
     </w:tbl>
-    <w:p/>
+    <w:p>
+      <w:pPr>
+        <w:rPr>
+          <w:lang w:val="en-US"/>
+        </w:rPr>
+      </w:pPr>
+    </w:p>
     <w:sectPr>
       <w:headerReference w:type="default" r:id="rId8"/>
       <w:footerReference w:type="default" r:id="rId9"/>

</xml_diff>